<commit_message>
Give each paper author an individual affiliation and email block
</commit_message>
<xml_diff>
--- a/assignment_docs/updated/Cloud_Equipment_Monitoring_Springer_TwoColumn.docx
+++ b/assignment_docs/updated/Cloud_Equipment_Monitoring_Springer_TwoColumn.docx
@@ -12,149 +12,908 @@
         <w:t>Predictive Maintenance and Monitoring of Simulated Industrial Equipment on AWS</w:t>
       </w:r>
     </w:p>
-    <w:p>
-      <w:pPr>
-        <w:keepNext/>
-        <w:widowControl/>
-        <w:spacing w:line="280" w:lineRule="exact"/>
-        <w:ind w:firstLine="0"/>
-        <w:jc w:val="center"/>
-      </w:pPr>
-      <w:r>
-        <w:rPr>
-          <w:rFonts w:ascii="Times New Roman" w:hAnsi="Times New Roman"/>
-          <w:sz w:val="24"/>
-        </w:rPr>
-        <w:t>Akshay Kripalani, Joel Jacob, Kaivalya Joglekar,</w:t>
-      </w:r>
-    </w:p>
-    <w:p>
-      <w:pPr>
-        <w:keepNext/>
-        <w:widowControl/>
-        <w:spacing w:line="280" w:lineRule="exact"/>
-        <w:ind w:firstLine="0"/>
-        <w:jc w:val="center"/>
-      </w:pPr>
-      <w:r>
-        <w:rPr>
-          <w:rFonts w:ascii="Times New Roman" w:hAnsi="Times New Roman"/>
-          <w:sz w:val="24"/>
-        </w:rPr>
-        <w:t>Kanish Jain, Manas Kulkarni and Rama Varshney</w:t>
-      </w:r>
-    </w:p>
-    <w:p>
-      <w:pPr>
-        <w:keepNext/>
-        <w:widowControl/>
-        <w:spacing w:line="260" w:lineRule="exact"/>
-        <w:ind w:firstLine="0"/>
-        <w:jc w:val="center"/>
-      </w:pPr>
-      <w:r>
-        <w:rPr>
-          <w:rFonts w:ascii="Times New Roman" w:hAnsi="Times New Roman"/>
-          <w:sz w:val="22"/>
-        </w:rPr>
-        <w:t>Department of Computer Engineering</w:t>
-      </w:r>
-    </w:p>
-    <w:p>
-      <w:pPr>
-        <w:keepNext/>
-        <w:widowControl/>
-        <w:spacing w:line="260" w:lineRule="exact"/>
-        <w:ind w:firstLine="0"/>
-        <w:jc w:val="center"/>
-      </w:pPr>
-      <w:r>
-        <w:rPr>
-          <w:rFonts w:ascii="Times New Roman" w:hAnsi="Times New Roman"/>
-          <w:sz w:val="22"/>
-        </w:rPr>
-        <w:t>Mukesh Patel School of Technology Management and Engineering</w:t>
-      </w:r>
-    </w:p>
-    <w:p>
-      <w:pPr>
-        <w:keepNext/>
-        <w:widowControl/>
-        <w:spacing w:line="260" w:lineRule="exact"/>
-        <w:ind w:firstLine="0"/>
-        <w:jc w:val="center"/>
-      </w:pPr>
-      <w:r>
-        <w:rPr>
-          <w:rFonts w:ascii="Times New Roman" w:hAnsi="Times New Roman"/>
-          <w:sz w:val="22"/>
-        </w:rPr>
-        <w:t>NMIMS, Mumbai, India</w:t>
-      </w:r>
-    </w:p>
-    <w:p>
-      <w:pPr>
-        <w:keepNext/>
-        <w:widowControl/>
-        <w:spacing w:line="220" w:lineRule="exact"/>
-        <w:ind w:firstLine="0"/>
-        <w:jc w:val="center"/>
-      </w:pPr>
-      <w:r>
-        <w:rPr>
-          <w:rFonts w:ascii="Times New Roman" w:hAnsi="Times New Roman"/>
-          <w:sz w:val="18"/>
-        </w:rPr>
-        <w:t>Rama Varshney: Assistant Professor</w:t>
-      </w:r>
-    </w:p>
-    <w:p>
-      <w:pPr>
-        <w:keepNext/>
-        <w:widowControl/>
-        <w:spacing w:line="220" w:lineRule="exact"/>
-        <w:ind w:firstLine="0"/>
-        <w:jc w:val="center"/>
-      </w:pPr>
-      <w:r>
-        <w:rPr>
-          <w:rFonts w:ascii="Times New Roman" w:hAnsi="Times New Roman"/>
-          <w:sz w:val="18"/>
-        </w:rPr>
-        <w:t>akshay.kripalani74@nmims.in, joelchirayil.jacob78@nmims.in</w:t>
-      </w:r>
-    </w:p>
-    <w:p>
-      <w:pPr>
-        <w:keepNext/>
-        <w:widowControl/>
-        <w:spacing w:line="220" w:lineRule="exact"/>
-        <w:ind w:firstLine="0"/>
-        <w:jc w:val="center"/>
-      </w:pPr>
-      <w:r>
-        <w:rPr>
-          <w:rFonts w:ascii="Times New Roman" w:hAnsi="Times New Roman"/>
-          <w:sz w:val="18"/>
-        </w:rPr>
-        <w:t>kaivalyarakesh.joglekar57@nmims.in, kanish.jain82@nmims.in</w:t>
-      </w:r>
-    </w:p>
-    <w:p>
-      <w:pPr>
-        <w:keepNext/>
-        <w:widowControl/>
-        <w:spacing w:line="220" w:lineRule="exact" w:after="240"/>
-        <w:ind w:firstLine="0"/>
-        <w:jc w:val="center"/>
-      </w:pPr>
-      <w:r>
-        <w:rPr>
-          <w:rFonts w:ascii="Times New Roman" w:hAnsi="Times New Roman"/>
-          <w:sz w:val="18"/>
-        </w:rPr>
-        <w:t>manas.kulkarni73@nmims.in, rama.varshney@nmims.edu</w:t>
-      </w:r>
+    <w:tbl>
+      <w:tblPr>
+        <w:tblW w:type="auto" w:w="0"/>
+        <w:tblLayout w:type="fixed"/>
+        <w:tblLook w:firstColumn="1" w:firstRow="1" w:lastColumn="0" w:lastRow="0" w:noHBand="0" w:noVBand="1" w:val="04A0"/>
+      </w:tblPr>
+      <w:tblGrid>
+        <w:gridCol w:w="3024"/>
+        <w:gridCol w:w="3024"/>
+        <w:gridCol w:w="3024"/>
+      </w:tblGrid>
+      <w:tr>
+        <w:trPr>
+          <w:cantSplit/>
+        </w:trPr>
+        <w:tc>
+          <w:tcPr>
+            <w:tcW w:type="dxa" w:w="3024"/>
+            <w:vAlign w:val="top"/>
+            <w:tcBorders>
+              <w:top w:val="nil"/>
+              <w:bottom w:val="nil"/>
+              <w:left w:val="nil"/>
+              <w:right w:val="nil"/>
+              <w:insideH w:val="nil"/>
+              <w:insideV w:val="nil"/>
+            </w:tcBorders>
+            <w:tcMar>
+              <w:top w:w="0" w:type="dxa"/>
+              <w:bottom w:w="40" w:type="dxa"/>
+              <w:left w:w="20" w:type="dxa"/>
+              <w:right w:w="20" w:type="dxa"/>
+            </w:tcMar>
+          </w:tcPr>
+          <w:p>
+            <w:pPr>
+              <w:keepNext/>
+              <w:spacing w:before="0" w:after="0" w:line="250" w:lineRule="exact"/>
+              <w:ind w:firstLine="0"/>
+              <w:jc w:val="center"/>
+              <w:suppressAutoHyphens w:val="1"/>
+            </w:pPr>
+            <w:r>
+              <w:rPr>
+                <w:rFonts w:ascii="Times New Roman" w:hAnsi="Times New Roman"/>
+                <w:b/>
+                <w:i w:val="0"/>
+                <w:sz w:val="22"/>
+              </w:rPr>
+              <w:t>Akshay Kripalani</w:t>
+            </w:r>
+          </w:p>
+          <w:p>
+            <w:pPr>
+              <w:keepNext/>
+              <w:spacing w:before="0" w:after="0" w:line="200" w:lineRule="exact"/>
+              <w:ind w:firstLine="0"/>
+              <w:jc w:val="center"/>
+              <w:suppressAutoHyphens w:val="1"/>
+            </w:pPr>
+            <w:r>
+              <w:rPr>
+                <w:rFonts w:ascii="Times New Roman" w:hAnsi="Times New Roman"/>
+                <w:b w:val="0"/>
+                <w:i/>
+                <w:sz w:val="17"/>
+              </w:rPr>
+              <w:t>Student</w:t>
+            </w:r>
+          </w:p>
+          <w:p>
+            <w:pPr>
+              <w:keepNext/>
+              <w:spacing w:before="0" w:after="0" w:line="200" w:lineRule="exact"/>
+              <w:ind w:firstLine="0"/>
+              <w:jc w:val="center"/>
+              <w:suppressAutoHyphens w:val="1"/>
+            </w:pPr>
+            <w:r>
+              <w:rPr>
+                <w:rFonts w:ascii="Times New Roman" w:hAnsi="Times New Roman"/>
+                <w:b w:val="0"/>
+                <w:i w:val="0"/>
+                <w:sz w:val="17"/>
+              </w:rPr>
+              <w:t>Department of Computer Engineering</w:t>
+            </w:r>
+          </w:p>
+          <w:p>
+            <w:pPr>
+              <w:keepNext/>
+              <w:spacing w:before="0" w:after="0" w:line="200" w:lineRule="exact"/>
+              <w:ind w:firstLine="0"/>
+              <w:jc w:val="center"/>
+              <w:suppressAutoHyphens w:val="1"/>
+            </w:pPr>
+            <w:r>
+              <w:rPr>
+                <w:rFonts w:ascii="Times New Roman" w:hAnsi="Times New Roman"/>
+                <w:b w:val="0"/>
+                <w:i w:val="0"/>
+                <w:sz w:val="17"/>
+              </w:rPr>
+              <w:t>Mukesh Patel School of Technology</w:t>
+            </w:r>
+          </w:p>
+          <w:p>
+            <w:pPr>
+              <w:keepNext/>
+              <w:spacing w:before="0" w:after="0" w:line="200" w:lineRule="exact"/>
+              <w:ind w:firstLine="0"/>
+              <w:jc w:val="center"/>
+              <w:suppressAutoHyphens w:val="1"/>
+            </w:pPr>
+            <w:r>
+              <w:rPr>
+                <w:rFonts w:ascii="Times New Roman" w:hAnsi="Times New Roman"/>
+                <w:b w:val="0"/>
+                <w:i w:val="0"/>
+                <w:sz w:val="17"/>
+              </w:rPr>
+              <w:t>Management and Engineering</w:t>
+            </w:r>
+          </w:p>
+          <w:p>
+            <w:pPr>
+              <w:keepNext/>
+              <w:spacing w:before="0" w:after="0" w:line="200" w:lineRule="exact"/>
+              <w:ind w:firstLine="0"/>
+              <w:jc w:val="center"/>
+              <w:suppressAutoHyphens w:val="1"/>
+            </w:pPr>
+            <w:r>
+              <w:rPr>
+                <w:rFonts w:ascii="Times New Roman" w:hAnsi="Times New Roman"/>
+                <w:b w:val="0"/>
+                <w:i w:val="0"/>
+                <w:sz w:val="17"/>
+              </w:rPr>
+              <w:t>NMIMS, Mumbai, India</w:t>
+            </w:r>
+          </w:p>
+          <w:p>
+            <w:pPr>
+              <w:keepNext/>
+              <w:spacing w:before="0" w:after="0" w:line="190" w:lineRule="exact"/>
+              <w:ind w:firstLine="0"/>
+              <w:jc w:val="center"/>
+              <w:suppressAutoHyphens w:val="1"/>
+            </w:pPr>
+            <w:r>
+              <w:rPr>
+                <w:rFonts w:ascii="Times New Roman" w:hAnsi="Times New Roman"/>
+                <w:b w:val="0"/>
+                <w:i w:val="0"/>
+                <w:sz w:val="16"/>
+              </w:rPr>
+              <w:t>akshay.kripalani74@nmims.in</w:t>
+            </w:r>
+          </w:p>
+        </w:tc>
+        <w:tc>
+          <w:tcPr>
+            <w:tcW w:type="dxa" w:w="3024"/>
+            <w:vAlign w:val="top"/>
+            <w:tcBorders>
+              <w:top w:val="nil"/>
+              <w:bottom w:val="nil"/>
+              <w:left w:val="nil"/>
+              <w:right w:val="nil"/>
+              <w:insideH w:val="nil"/>
+              <w:insideV w:val="nil"/>
+            </w:tcBorders>
+            <w:tcMar>
+              <w:top w:w="0" w:type="dxa"/>
+              <w:bottom w:w="40" w:type="dxa"/>
+              <w:left w:w="20" w:type="dxa"/>
+              <w:right w:w="20" w:type="dxa"/>
+            </w:tcMar>
+          </w:tcPr>
+          <w:p>
+            <w:pPr>
+              <w:keepNext/>
+              <w:spacing w:before="0" w:after="0" w:line="250" w:lineRule="exact"/>
+              <w:ind w:firstLine="0"/>
+              <w:jc w:val="center"/>
+              <w:suppressAutoHyphens w:val="1"/>
+            </w:pPr>
+            <w:r>
+              <w:rPr>
+                <w:rFonts w:ascii="Times New Roman" w:hAnsi="Times New Roman"/>
+                <w:b/>
+                <w:i w:val="0"/>
+                <w:sz w:val="22"/>
+              </w:rPr>
+              <w:t>Joel Jacob</w:t>
+            </w:r>
+          </w:p>
+          <w:p>
+            <w:pPr>
+              <w:keepNext/>
+              <w:spacing w:before="0" w:after="0" w:line="200" w:lineRule="exact"/>
+              <w:ind w:firstLine="0"/>
+              <w:jc w:val="center"/>
+              <w:suppressAutoHyphens w:val="1"/>
+            </w:pPr>
+            <w:r>
+              <w:rPr>
+                <w:rFonts w:ascii="Times New Roman" w:hAnsi="Times New Roman"/>
+                <w:b w:val="0"/>
+                <w:i/>
+                <w:sz w:val="17"/>
+              </w:rPr>
+              <w:t>Student</w:t>
+            </w:r>
+          </w:p>
+          <w:p>
+            <w:pPr>
+              <w:keepNext/>
+              <w:spacing w:before="0" w:after="0" w:line="200" w:lineRule="exact"/>
+              <w:ind w:firstLine="0"/>
+              <w:jc w:val="center"/>
+              <w:suppressAutoHyphens w:val="1"/>
+            </w:pPr>
+            <w:r>
+              <w:rPr>
+                <w:rFonts w:ascii="Times New Roman" w:hAnsi="Times New Roman"/>
+                <w:b w:val="0"/>
+                <w:i w:val="0"/>
+                <w:sz w:val="17"/>
+              </w:rPr>
+              <w:t>Department of Computer Engineering</w:t>
+            </w:r>
+          </w:p>
+          <w:p>
+            <w:pPr>
+              <w:keepNext/>
+              <w:spacing w:before="0" w:after="0" w:line="200" w:lineRule="exact"/>
+              <w:ind w:firstLine="0"/>
+              <w:jc w:val="center"/>
+              <w:suppressAutoHyphens w:val="1"/>
+            </w:pPr>
+            <w:r>
+              <w:rPr>
+                <w:rFonts w:ascii="Times New Roman" w:hAnsi="Times New Roman"/>
+                <w:b w:val="0"/>
+                <w:i w:val="0"/>
+                <w:sz w:val="17"/>
+              </w:rPr>
+              <w:t>Mukesh Patel School of Technology</w:t>
+            </w:r>
+          </w:p>
+          <w:p>
+            <w:pPr>
+              <w:keepNext/>
+              <w:spacing w:before="0" w:after="0" w:line="200" w:lineRule="exact"/>
+              <w:ind w:firstLine="0"/>
+              <w:jc w:val="center"/>
+              <w:suppressAutoHyphens w:val="1"/>
+            </w:pPr>
+            <w:r>
+              <w:rPr>
+                <w:rFonts w:ascii="Times New Roman" w:hAnsi="Times New Roman"/>
+                <w:b w:val="0"/>
+                <w:i w:val="0"/>
+                <w:sz w:val="17"/>
+              </w:rPr>
+              <w:t>Management and Engineering</w:t>
+            </w:r>
+          </w:p>
+          <w:p>
+            <w:pPr>
+              <w:keepNext/>
+              <w:spacing w:before="0" w:after="0" w:line="200" w:lineRule="exact"/>
+              <w:ind w:firstLine="0"/>
+              <w:jc w:val="center"/>
+              <w:suppressAutoHyphens w:val="1"/>
+            </w:pPr>
+            <w:r>
+              <w:rPr>
+                <w:rFonts w:ascii="Times New Roman" w:hAnsi="Times New Roman"/>
+                <w:b w:val="0"/>
+                <w:i w:val="0"/>
+                <w:sz w:val="17"/>
+              </w:rPr>
+              <w:t>NMIMS, Mumbai, India</w:t>
+            </w:r>
+          </w:p>
+          <w:p>
+            <w:pPr>
+              <w:keepNext/>
+              <w:spacing w:before="0" w:after="0" w:line="190" w:lineRule="exact"/>
+              <w:ind w:firstLine="0"/>
+              <w:jc w:val="center"/>
+              <w:suppressAutoHyphens w:val="1"/>
+            </w:pPr>
+            <w:r>
+              <w:rPr>
+                <w:rFonts w:ascii="Times New Roman" w:hAnsi="Times New Roman"/>
+                <w:b w:val="0"/>
+                <w:i w:val="0"/>
+                <w:sz w:val="16"/>
+              </w:rPr>
+              <w:t>joelchirayil.jacob78@nmims.in</w:t>
+            </w:r>
+          </w:p>
+        </w:tc>
+        <w:tc>
+          <w:tcPr>
+            <w:tcW w:type="dxa" w:w="3024"/>
+            <w:vAlign w:val="top"/>
+            <w:tcBorders>
+              <w:top w:val="nil"/>
+              <w:bottom w:val="nil"/>
+              <w:left w:val="nil"/>
+              <w:right w:val="nil"/>
+              <w:insideH w:val="nil"/>
+              <w:insideV w:val="nil"/>
+            </w:tcBorders>
+            <w:tcMar>
+              <w:top w:w="0" w:type="dxa"/>
+              <w:bottom w:w="40" w:type="dxa"/>
+              <w:left w:w="20" w:type="dxa"/>
+              <w:right w:w="20" w:type="dxa"/>
+            </w:tcMar>
+          </w:tcPr>
+          <w:p>
+            <w:pPr>
+              <w:keepNext/>
+              <w:spacing w:before="0" w:after="0" w:line="250" w:lineRule="exact"/>
+              <w:ind w:firstLine="0"/>
+              <w:jc w:val="center"/>
+              <w:suppressAutoHyphens w:val="1"/>
+            </w:pPr>
+            <w:r>
+              <w:rPr>
+                <w:rFonts w:ascii="Times New Roman" w:hAnsi="Times New Roman"/>
+                <w:b/>
+                <w:i w:val="0"/>
+                <w:sz w:val="22"/>
+              </w:rPr>
+              <w:t>Kaivalya Joglekar</w:t>
+            </w:r>
+          </w:p>
+          <w:p>
+            <w:pPr>
+              <w:keepNext/>
+              <w:spacing w:before="0" w:after="0" w:line="200" w:lineRule="exact"/>
+              <w:ind w:firstLine="0"/>
+              <w:jc w:val="center"/>
+              <w:suppressAutoHyphens w:val="1"/>
+            </w:pPr>
+            <w:r>
+              <w:rPr>
+                <w:rFonts w:ascii="Times New Roman" w:hAnsi="Times New Roman"/>
+                <w:b w:val="0"/>
+                <w:i/>
+                <w:sz w:val="17"/>
+              </w:rPr>
+              <w:t>Student</w:t>
+            </w:r>
+          </w:p>
+          <w:p>
+            <w:pPr>
+              <w:keepNext/>
+              <w:spacing w:before="0" w:after="0" w:line="200" w:lineRule="exact"/>
+              <w:ind w:firstLine="0"/>
+              <w:jc w:val="center"/>
+              <w:suppressAutoHyphens w:val="1"/>
+            </w:pPr>
+            <w:r>
+              <w:rPr>
+                <w:rFonts w:ascii="Times New Roman" w:hAnsi="Times New Roman"/>
+                <w:b w:val="0"/>
+                <w:i w:val="0"/>
+                <w:sz w:val="17"/>
+              </w:rPr>
+              <w:t>Department of Computer Engineering</w:t>
+            </w:r>
+          </w:p>
+          <w:p>
+            <w:pPr>
+              <w:keepNext/>
+              <w:spacing w:before="0" w:after="0" w:line="200" w:lineRule="exact"/>
+              <w:ind w:firstLine="0"/>
+              <w:jc w:val="center"/>
+              <w:suppressAutoHyphens w:val="1"/>
+            </w:pPr>
+            <w:r>
+              <w:rPr>
+                <w:rFonts w:ascii="Times New Roman" w:hAnsi="Times New Roman"/>
+                <w:b w:val="0"/>
+                <w:i w:val="0"/>
+                <w:sz w:val="17"/>
+              </w:rPr>
+              <w:t>Mukesh Patel School of Technology</w:t>
+            </w:r>
+          </w:p>
+          <w:p>
+            <w:pPr>
+              <w:keepNext/>
+              <w:spacing w:before="0" w:after="0" w:line="200" w:lineRule="exact"/>
+              <w:ind w:firstLine="0"/>
+              <w:jc w:val="center"/>
+              <w:suppressAutoHyphens w:val="1"/>
+            </w:pPr>
+            <w:r>
+              <w:rPr>
+                <w:rFonts w:ascii="Times New Roman" w:hAnsi="Times New Roman"/>
+                <w:b w:val="0"/>
+                <w:i w:val="0"/>
+                <w:sz w:val="17"/>
+              </w:rPr>
+              <w:t>Management and Engineering</w:t>
+            </w:r>
+          </w:p>
+          <w:p>
+            <w:pPr>
+              <w:keepNext/>
+              <w:spacing w:before="0" w:after="0" w:line="200" w:lineRule="exact"/>
+              <w:ind w:firstLine="0"/>
+              <w:jc w:val="center"/>
+              <w:suppressAutoHyphens w:val="1"/>
+            </w:pPr>
+            <w:r>
+              <w:rPr>
+                <w:rFonts w:ascii="Times New Roman" w:hAnsi="Times New Roman"/>
+                <w:b w:val="0"/>
+                <w:i w:val="0"/>
+                <w:sz w:val="17"/>
+              </w:rPr>
+              <w:t>NMIMS, Mumbai, India</w:t>
+            </w:r>
+          </w:p>
+          <w:p>
+            <w:pPr>
+              <w:keepNext/>
+              <w:spacing w:before="0" w:after="0" w:line="190" w:lineRule="exact"/>
+              <w:ind w:firstLine="0"/>
+              <w:jc w:val="center"/>
+              <w:suppressAutoHyphens w:val="1"/>
+            </w:pPr>
+            <w:r>
+              <w:rPr>
+                <w:rFonts w:ascii="Times New Roman" w:hAnsi="Times New Roman"/>
+                <w:b w:val="0"/>
+                <w:i w:val="0"/>
+                <w:sz w:val="16"/>
+              </w:rPr>
+              <w:t>kaivalyarakesh.joglekar57@nmims.in</w:t>
+            </w:r>
+          </w:p>
+        </w:tc>
+      </w:tr>
+      <w:tr>
+        <w:trPr>
+          <w:cantSplit/>
+        </w:trPr>
+        <w:tc>
+          <w:tcPr>
+            <w:tcW w:type="dxa" w:w="3024"/>
+            <w:vAlign w:val="top"/>
+            <w:tcBorders>
+              <w:top w:val="nil"/>
+              <w:bottom w:val="nil"/>
+              <w:left w:val="nil"/>
+              <w:right w:val="nil"/>
+              <w:insideH w:val="nil"/>
+              <w:insideV w:val="nil"/>
+            </w:tcBorders>
+            <w:tcMar>
+              <w:top w:w="140" w:type="dxa"/>
+              <w:bottom w:w="40" w:type="dxa"/>
+              <w:left w:w="20" w:type="dxa"/>
+              <w:right w:w="20" w:type="dxa"/>
+            </w:tcMar>
+          </w:tcPr>
+          <w:p>
+            <w:pPr>
+              <w:keepNext/>
+              <w:spacing w:before="0" w:after="0" w:line="250" w:lineRule="exact"/>
+              <w:ind w:firstLine="0"/>
+              <w:jc w:val="center"/>
+              <w:suppressAutoHyphens w:val="1"/>
+            </w:pPr>
+            <w:r>
+              <w:rPr>
+                <w:rFonts w:ascii="Times New Roman" w:hAnsi="Times New Roman"/>
+                <w:b/>
+                <w:i w:val="0"/>
+                <w:sz w:val="22"/>
+              </w:rPr>
+              <w:t>Kanish Jain</w:t>
+            </w:r>
+          </w:p>
+          <w:p>
+            <w:pPr>
+              <w:keepNext/>
+              <w:spacing w:before="0" w:after="0" w:line="200" w:lineRule="exact"/>
+              <w:ind w:firstLine="0"/>
+              <w:jc w:val="center"/>
+              <w:suppressAutoHyphens w:val="1"/>
+            </w:pPr>
+            <w:r>
+              <w:rPr>
+                <w:rFonts w:ascii="Times New Roman" w:hAnsi="Times New Roman"/>
+                <w:b w:val="0"/>
+                <w:i/>
+                <w:sz w:val="17"/>
+              </w:rPr>
+              <w:t>Student</w:t>
+            </w:r>
+          </w:p>
+          <w:p>
+            <w:pPr>
+              <w:keepNext/>
+              <w:spacing w:before="0" w:after="0" w:line="200" w:lineRule="exact"/>
+              <w:ind w:firstLine="0"/>
+              <w:jc w:val="center"/>
+              <w:suppressAutoHyphens w:val="1"/>
+            </w:pPr>
+            <w:r>
+              <w:rPr>
+                <w:rFonts w:ascii="Times New Roman" w:hAnsi="Times New Roman"/>
+                <w:b w:val="0"/>
+                <w:i w:val="0"/>
+                <w:sz w:val="17"/>
+              </w:rPr>
+              <w:t>Department of Computer Engineering</w:t>
+            </w:r>
+          </w:p>
+          <w:p>
+            <w:pPr>
+              <w:keepNext/>
+              <w:spacing w:before="0" w:after="0" w:line="200" w:lineRule="exact"/>
+              <w:ind w:firstLine="0"/>
+              <w:jc w:val="center"/>
+              <w:suppressAutoHyphens w:val="1"/>
+            </w:pPr>
+            <w:r>
+              <w:rPr>
+                <w:rFonts w:ascii="Times New Roman" w:hAnsi="Times New Roman"/>
+                <w:b w:val="0"/>
+                <w:i w:val="0"/>
+                <w:sz w:val="17"/>
+              </w:rPr>
+              <w:t>Mukesh Patel School of Technology</w:t>
+            </w:r>
+          </w:p>
+          <w:p>
+            <w:pPr>
+              <w:keepNext/>
+              <w:spacing w:before="0" w:after="0" w:line="200" w:lineRule="exact"/>
+              <w:ind w:firstLine="0"/>
+              <w:jc w:val="center"/>
+              <w:suppressAutoHyphens w:val="1"/>
+            </w:pPr>
+            <w:r>
+              <w:rPr>
+                <w:rFonts w:ascii="Times New Roman" w:hAnsi="Times New Roman"/>
+                <w:b w:val="0"/>
+                <w:i w:val="0"/>
+                <w:sz w:val="17"/>
+              </w:rPr>
+              <w:t>Management and Engineering</w:t>
+            </w:r>
+          </w:p>
+          <w:p>
+            <w:pPr>
+              <w:keepNext/>
+              <w:spacing w:before="0" w:after="0" w:line="200" w:lineRule="exact"/>
+              <w:ind w:firstLine="0"/>
+              <w:jc w:val="center"/>
+              <w:suppressAutoHyphens w:val="1"/>
+            </w:pPr>
+            <w:r>
+              <w:rPr>
+                <w:rFonts w:ascii="Times New Roman" w:hAnsi="Times New Roman"/>
+                <w:b w:val="0"/>
+                <w:i w:val="0"/>
+                <w:sz w:val="17"/>
+              </w:rPr>
+              <w:t>NMIMS, Mumbai, India</w:t>
+            </w:r>
+          </w:p>
+          <w:p>
+            <w:pPr>
+              <w:keepNext/>
+              <w:spacing w:before="0" w:after="0" w:line="190" w:lineRule="exact"/>
+              <w:ind w:firstLine="0"/>
+              <w:jc w:val="center"/>
+              <w:suppressAutoHyphens w:val="1"/>
+            </w:pPr>
+            <w:r>
+              <w:rPr>
+                <w:rFonts w:ascii="Times New Roman" w:hAnsi="Times New Roman"/>
+                <w:b w:val="0"/>
+                <w:i w:val="0"/>
+                <w:sz w:val="16"/>
+              </w:rPr>
+              <w:t>kanish.jain82@nmims.in</w:t>
+            </w:r>
+          </w:p>
+        </w:tc>
+        <w:tc>
+          <w:tcPr>
+            <w:tcW w:type="dxa" w:w="3024"/>
+            <w:vAlign w:val="top"/>
+            <w:tcBorders>
+              <w:top w:val="nil"/>
+              <w:bottom w:val="nil"/>
+              <w:left w:val="nil"/>
+              <w:right w:val="nil"/>
+              <w:insideH w:val="nil"/>
+              <w:insideV w:val="nil"/>
+            </w:tcBorders>
+            <w:tcMar>
+              <w:top w:w="140" w:type="dxa"/>
+              <w:bottom w:w="40" w:type="dxa"/>
+              <w:left w:w="20" w:type="dxa"/>
+              <w:right w:w="20" w:type="dxa"/>
+            </w:tcMar>
+          </w:tcPr>
+          <w:p>
+            <w:pPr>
+              <w:keepNext/>
+              <w:spacing w:before="0" w:after="0" w:line="250" w:lineRule="exact"/>
+              <w:ind w:firstLine="0"/>
+              <w:jc w:val="center"/>
+              <w:suppressAutoHyphens w:val="1"/>
+            </w:pPr>
+            <w:r>
+              <w:rPr>
+                <w:rFonts w:ascii="Times New Roman" w:hAnsi="Times New Roman"/>
+                <w:b/>
+                <w:i w:val="0"/>
+                <w:sz w:val="22"/>
+              </w:rPr>
+              <w:t>Manas Kulkarni</w:t>
+            </w:r>
+          </w:p>
+          <w:p>
+            <w:pPr>
+              <w:keepNext/>
+              <w:spacing w:before="0" w:after="0" w:line="200" w:lineRule="exact"/>
+              <w:ind w:firstLine="0"/>
+              <w:jc w:val="center"/>
+              <w:suppressAutoHyphens w:val="1"/>
+            </w:pPr>
+            <w:r>
+              <w:rPr>
+                <w:rFonts w:ascii="Times New Roman" w:hAnsi="Times New Roman"/>
+                <w:b w:val="0"/>
+                <w:i/>
+                <w:sz w:val="17"/>
+              </w:rPr>
+              <w:t>Student</w:t>
+            </w:r>
+          </w:p>
+          <w:p>
+            <w:pPr>
+              <w:keepNext/>
+              <w:spacing w:before="0" w:after="0" w:line="200" w:lineRule="exact"/>
+              <w:ind w:firstLine="0"/>
+              <w:jc w:val="center"/>
+              <w:suppressAutoHyphens w:val="1"/>
+            </w:pPr>
+            <w:r>
+              <w:rPr>
+                <w:rFonts w:ascii="Times New Roman" w:hAnsi="Times New Roman"/>
+                <w:b w:val="0"/>
+                <w:i w:val="0"/>
+                <w:sz w:val="17"/>
+              </w:rPr>
+              <w:t>Department of Computer Engineering</w:t>
+            </w:r>
+          </w:p>
+          <w:p>
+            <w:pPr>
+              <w:keepNext/>
+              <w:spacing w:before="0" w:after="0" w:line="200" w:lineRule="exact"/>
+              <w:ind w:firstLine="0"/>
+              <w:jc w:val="center"/>
+              <w:suppressAutoHyphens w:val="1"/>
+            </w:pPr>
+            <w:r>
+              <w:rPr>
+                <w:rFonts w:ascii="Times New Roman" w:hAnsi="Times New Roman"/>
+                <w:b w:val="0"/>
+                <w:i w:val="0"/>
+                <w:sz w:val="17"/>
+              </w:rPr>
+              <w:t>Mukesh Patel School of Technology</w:t>
+            </w:r>
+          </w:p>
+          <w:p>
+            <w:pPr>
+              <w:keepNext/>
+              <w:spacing w:before="0" w:after="0" w:line="200" w:lineRule="exact"/>
+              <w:ind w:firstLine="0"/>
+              <w:jc w:val="center"/>
+              <w:suppressAutoHyphens w:val="1"/>
+            </w:pPr>
+            <w:r>
+              <w:rPr>
+                <w:rFonts w:ascii="Times New Roman" w:hAnsi="Times New Roman"/>
+                <w:b w:val="0"/>
+                <w:i w:val="0"/>
+                <w:sz w:val="17"/>
+              </w:rPr>
+              <w:t>Management and Engineering</w:t>
+            </w:r>
+          </w:p>
+          <w:p>
+            <w:pPr>
+              <w:keepNext/>
+              <w:spacing w:before="0" w:after="0" w:line="200" w:lineRule="exact"/>
+              <w:ind w:firstLine="0"/>
+              <w:jc w:val="center"/>
+              <w:suppressAutoHyphens w:val="1"/>
+            </w:pPr>
+            <w:r>
+              <w:rPr>
+                <w:rFonts w:ascii="Times New Roman" w:hAnsi="Times New Roman"/>
+                <w:b w:val="0"/>
+                <w:i w:val="0"/>
+                <w:sz w:val="17"/>
+              </w:rPr>
+              <w:t>NMIMS, Mumbai, India</w:t>
+            </w:r>
+          </w:p>
+          <w:p>
+            <w:pPr>
+              <w:keepNext/>
+              <w:spacing w:before="0" w:after="0" w:line="190" w:lineRule="exact"/>
+              <w:ind w:firstLine="0"/>
+              <w:jc w:val="center"/>
+              <w:suppressAutoHyphens w:val="1"/>
+            </w:pPr>
+            <w:r>
+              <w:rPr>
+                <w:rFonts w:ascii="Times New Roman" w:hAnsi="Times New Roman"/>
+                <w:b w:val="0"/>
+                <w:i w:val="0"/>
+                <w:sz w:val="16"/>
+              </w:rPr>
+              <w:t>manas.kulkarni73@nmims.in</w:t>
+            </w:r>
+          </w:p>
+        </w:tc>
+        <w:tc>
+          <w:tcPr>
+            <w:tcW w:type="dxa" w:w="3024"/>
+            <w:vAlign w:val="top"/>
+            <w:tcBorders>
+              <w:top w:val="nil"/>
+              <w:bottom w:val="nil"/>
+              <w:left w:val="nil"/>
+              <w:right w:val="nil"/>
+              <w:insideH w:val="nil"/>
+              <w:insideV w:val="nil"/>
+            </w:tcBorders>
+            <w:tcMar>
+              <w:top w:w="140" w:type="dxa"/>
+              <w:bottom w:w="40" w:type="dxa"/>
+              <w:left w:w="20" w:type="dxa"/>
+              <w:right w:w="20" w:type="dxa"/>
+            </w:tcMar>
+          </w:tcPr>
+          <w:p>
+            <w:pPr>
+              <w:keepNext/>
+              <w:spacing w:before="0" w:after="0" w:line="250" w:lineRule="exact"/>
+              <w:ind w:firstLine="0"/>
+              <w:jc w:val="center"/>
+              <w:suppressAutoHyphens w:val="1"/>
+            </w:pPr>
+            <w:r>
+              <w:rPr>
+                <w:rFonts w:ascii="Times New Roman" w:hAnsi="Times New Roman"/>
+                <w:b/>
+                <w:i w:val="0"/>
+                <w:sz w:val="22"/>
+              </w:rPr>
+              <w:t>Rama Varshney</w:t>
+            </w:r>
+          </w:p>
+          <w:p>
+            <w:pPr>
+              <w:keepNext/>
+              <w:spacing w:before="0" w:after="0" w:line="200" w:lineRule="exact"/>
+              <w:ind w:firstLine="0"/>
+              <w:jc w:val="center"/>
+              <w:suppressAutoHyphens w:val="1"/>
+            </w:pPr>
+            <w:r>
+              <w:rPr>
+                <w:rFonts w:ascii="Times New Roman" w:hAnsi="Times New Roman"/>
+                <w:b w:val="0"/>
+                <w:i/>
+                <w:sz w:val="17"/>
+              </w:rPr>
+              <w:t>Assistant Professor</w:t>
+            </w:r>
+          </w:p>
+          <w:p>
+            <w:pPr>
+              <w:keepNext/>
+              <w:spacing w:before="0" w:after="0" w:line="200" w:lineRule="exact"/>
+              <w:ind w:firstLine="0"/>
+              <w:jc w:val="center"/>
+              <w:suppressAutoHyphens w:val="1"/>
+            </w:pPr>
+            <w:r>
+              <w:rPr>
+                <w:rFonts w:ascii="Times New Roman" w:hAnsi="Times New Roman"/>
+                <w:b w:val="0"/>
+                <w:i w:val="0"/>
+                <w:sz w:val="17"/>
+              </w:rPr>
+              <w:t>Department of Computer Engineering</w:t>
+            </w:r>
+          </w:p>
+          <w:p>
+            <w:pPr>
+              <w:keepNext/>
+              <w:spacing w:before="0" w:after="0" w:line="200" w:lineRule="exact"/>
+              <w:ind w:firstLine="0"/>
+              <w:jc w:val="center"/>
+              <w:suppressAutoHyphens w:val="1"/>
+            </w:pPr>
+            <w:r>
+              <w:rPr>
+                <w:rFonts w:ascii="Times New Roman" w:hAnsi="Times New Roman"/>
+                <w:b w:val="0"/>
+                <w:i w:val="0"/>
+                <w:sz w:val="17"/>
+              </w:rPr>
+              <w:t>Mukesh Patel School of Technology</w:t>
+            </w:r>
+          </w:p>
+          <w:p>
+            <w:pPr>
+              <w:keepNext/>
+              <w:spacing w:before="0" w:after="0" w:line="200" w:lineRule="exact"/>
+              <w:ind w:firstLine="0"/>
+              <w:jc w:val="center"/>
+              <w:suppressAutoHyphens w:val="1"/>
+            </w:pPr>
+            <w:r>
+              <w:rPr>
+                <w:rFonts w:ascii="Times New Roman" w:hAnsi="Times New Roman"/>
+                <w:b w:val="0"/>
+                <w:i w:val="0"/>
+                <w:sz w:val="17"/>
+              </w:rPr>
+              <w:t>Management and Engineering</w:t>
+            </w:r>
+          </w:p>
+          <w:p>
+            <w:pPr>
+              <w:keepNext/>
+              <w:spacing w:before="0" w:after="0" w:line="200" w:lineRule="exact"/>
+              <w:ind w:firstLine="0"/>
+              <w:jc w:val="center"/>
+              <w:suppressAutoHyphens w:val="1"/>
+            </w:pPr>
+            <w:r>
+              <w:rPr>
+                <w:rFonts w:ascii="Times New Roman" w:hAnsi="Times New Roman"/>
+                <w:b w:val="0"/>
+                <w:i w:val="0"/>
+                <w:sz w:val="17"/>
+              </w:rPr>
+              <w:t>NMIMS, Mumbai, India</w:t>
+            </w:r>
+          </w:p>
+          <w:p>
+            <w:pPr>
+              <w:keepNext/>
+              <w:spacing w:before="0" w:after="0" w:line="190" w:lineRule="exact"/>
+              <w:ind w:firstLine="0"/>
+              <w:jc w:val="center"/>
+              <w:suppressAutoHyphens w:val="1"/>
+            </w:pPr>
+            <w:r>
+              <w:rPr>
+                <w:rFonts w:ascii="Times New Roman" w:hAnsi="Times New Roman"/>
+                <w:b w:val="0"/>
+                <w:i w:val="0"/>
+                <w:sz w:val="16"/>
+              </w:rPr>
+              <w:t>rama.varshney@nmims.edu</w:t>
+            </w:r>
+          </w:p>
+        </w:tc>
+      </w:tr>
+    </w:tbl>
+    <w:p>
+      <w:pPr>
+        <w:spacing w:line="20" w:lineRule="exact" w:after="200"/>
+      </w:pPr>
     </w:p>
     <w:p>
       <w:pPr>
@@ -2638,18 +3397,6 @@
         </w:rPr>
         <w:t>6. Amazon Web Services: Amazon DynamoDB transactions: how it works. https://docs.aws.amazon.com/amazondynamodb/latest/developerguide/transaction-apis.html. Accessed 27 Oct 2026</w:t>
       </w:r>
-    </w:p>
-    <w:p>
-      <w:pPr>
-        <w:spacing w:before="0" w:after="0" w:line="20" w:lineRule="exact"/>
-        <w:ind w:firstLine="0"/>
-        <w:sectPr>
-          <w:type w:val="continuous"/>
-          <w:pgSz w:h="16838" w:w="11906" w:orient="portrait"/>
-          <w:pgMar w:bottom="3118" w:top="1474" w:left="1587" w:right="1247" w:header="2381" w:footer="2381"/>
-          <w:cols w:num="2" w:space="454" w:equalWidth="1"/>
-        </w:sectPr>
-      </w:pPr>
     </w:p>
     <w:sectPr>
       <w:type w:val="continuous"/>

</xml_diff>